<commit_message>
Document the admin panel and the cross-site cookie fix
Adds a "Panneau d'administration" section to the technical doc and a
matching slide to the presentation, plus deployment notes about
API_PROXY_TARGET and why /api/* is proxied through the frontend origin.
</commit_message>
<xml_diff>
--- a/DOCUMENTATION_TECHNIQUE.docx
+++ b/DOCUMENTATION_TECHNIQUE.docx
@@ -143,6 +143,14 @@
           <w:t>Déploiement</w:t>
         </w:r>
       </w:hyperlink>
+    </w:p>
+    <w:p>
+      <w:pPr>
+        <w:pStyle w:val="ListNumber"/>
+      </w:pPr>
+      <w:r>
+        <w:t>Panneau d'administration</w:t>
+      </w:r>
     </w:p>
     <w:p>
       <w:pPr>
@@ -2786,10 +2794,69 @@
     </w:p>
     <w:p>
       <w:pPr>
+        <w:pStyle w:val="ListBullet"/>
+      </w:pPr>
+      <w:r>
+        <w:t>CORS / cookies cross-site : le frontend proxifie /api/* vers le backend via next.config.ts (rewrites) plutôt que d'appeler l'URL Cloud Run directement — sans ça, le cookie de refresh token est considéré tiers (domaine différent) et certains navigateurs le bloquent par défaut, cassant la session au rechargement.</w:t>
+      </w:r>
+    </w:p>
+    <w:p>
+      <w:r>
+        <w:t>Variable d'environnement requise côté frontend en production : API_PROXY_TARGET (URL du service Cloud Run de l'API), en plus de CORS_ORIGIN côté API qui doit pointer vers le domaine réel du site.</w:t>
+      </w:r>
+    </w:p>
+    <w:p>
+      <w:pPr>
         <w:pStyle w:val="Heading1"/>
       </w:pPr>
       <w:r>
-        <w:t>10. Limites connues</w:t>
+        <w:t>10. Panneau d'administration</w:t>
+      </w:r>
+    </w:p>
+    <w:p>
+      <w:pPr/>
+      <w:r>
+        <w:t>Accessible sur /admin (rôle ADMIN requis, lien affiché dans le dashboard uniquement pour ce rôle). Fournit :</w:t>
+      </w:r>
+    </w:p>
+    <w:p>
+      <w:pPr>
+        <w:pStyle w:val="ListBullet"/>
+      </w:pPr>
+      <w:r>
+        <w:t>Vue d'ensemble : statistiques clés (utilisateurs, compétences, matchs et sessions par statut, points distribués), graphique des inscriptions sur 14 jours, dernières entrées du journal d'audit</w:t>
+      </w:r>
+    </w:p>
+    <w:p>
+      <w:pPr>
+        <w:pStyle w:val="ListBullet"/>
+      </w:pPr>
+      <w:r>
+        <w:t>Gestion complète (créer / modifier / supprimer) : utilisateurs (rôle, points), compétences, matchs, sessions, badges et leur attribution, articles, ajustements de points</w:t>
+      </w:r>
+    </w:p>
+    <w:p>
+      <w:pPr>
+        <w:pStyle w:val="ListBullet"/>
+      </w:pPr>
+      <w:r>
+        <w:t>Journal d'audit en lecture seule (les 200 dernières actions)</w:t>
+      </w:r>
+    </w:p>
+    <w:p>
+      <w:pPr>
+        <w:pStyle w:val="ListBullet"/>
+      </w:pPr>
+      <w:r>
+        <w:t>Toutes les routes sont sous /api/admin, protégées par le middleware requireRole("ADMIN") ; chaque modification/suppression de compte et ajustement de points est journalisée dans AuditLog</w:t>
+      </w:r>
+    </w:p>
+    <w:p>
+      <w:pPr>
+        <w:pStyle w:val="Heading1"/>
+      </w:pPr>
+      <w:r>
+        <w:t>11. Limites connues</w:t>
       </w:r>
     </w:p>
     <w:p>

</xml_diff>